<commit_message>
Extend template language with dates and signer fields
</commit_message>
<xml_diff>
--- a/src-tauri/templates/Рапорт на відпустку.docx
+++ b/src-tauri/templates/Рапорт на відпустку.docx
@@ -95,7 +95,7 @@
           <w:b w:val="0"/>
           <w:sz w:val="24"/>
         </w:rPr>
-        <w:t>Дата народження: {{soldier.birthDate}}</w:t>
+        <w:t>Дата рапорту: {{document.date}}; Дата народження: {{soldier.birthDate}}</w:t>
       </w:r>
     </w:p>
     <w:p>
@@ -122,7 +122,7 @@
           <w:b w:val="0"/>
           <w:sz w:val="24"/>
         </w:rPr>
-        <w:t>{{mainRank}} {{mainName}}</w:t>
+        <w:t>{{main.rank}} {{main.fullName}}</w:t>
       </w:r>
     </w:p>
     <w:p>
@@ -136,7 +136,7 @@
           <w:b w:val="0"/>
           <w:sz w:val="24"/>
         </w:rPr>
-        <w:t>{{mainPosition}}</w:t>
+        <w:t>{{main.position}}</w:t>
       </w:r>
     </w:p>
     <w:sectPr>

</xml_diff>